<commit_message>
feat(word): convert templates to static placeholders
</commit_message>
<xml_diff>
--- a/templates/word/1. Khai nhận di sản Vũ Dương.docx
+++ b/templates/word/1. Khai nhận di sản Vũ Dương.docx
@@ -1,5 +1,55 @@
 
-<file path=word/document.xml><?xml version="1.0" encoding="utf-8"?>
+<file path=docProps\app.xml><?xml version="1.0" encoding="utf-8"?>
+<Properties xmlns="http://schemas.openxmlformats.org/officeDocument/2006/extended-properties" xmlns:vt="http://schemas.openxmlformats.org/officeDocument/2006/docPropsVTypes">
+  <Template>Normal.dotm</Template>
+  <TotalTime>492</TotalTime>
+  <Pages>6</Pages>
+  <Words>1232</Words>
+  <Characters>7028</Characters>
+  <Application>Microsoft Office Word</Application>
+  <DocSecurity>0</DocSecurity>
+  <Lines>58</Lines>
+  <Paragraphs>16</Paragraphs>
+  <ScaleCrop>false</ScaleCrop>
+  <HeadingPairs>
+    <vt:vector size="2" baseType="variant">
+      <vt:variant>
+        <vt:lpstr>Title</vt:lpstr>
+      </vt:variant>
+      <vt:variant>
+        <vt:i4>1</vt:i4>
+      </vt:variant>
+    </vt:vector>
+  </HeadingPairs>
+  <TitlesOfParts>
+    <vt:vector size="1" baseType="lpstr">
+      <vt:lpstr/>
+    </vt:vector>
+  </TitlesOfParts>
+  <Company/>
+  <LinksUpToDate>false</LinksUpToDate>
+  <CharactersWithSpaces>8244</CharactersWithSpaces>
+  <SharedDoc>false</SharedDoc>
+  <HyperlinksChanged>false</HyperlinksChanged>
+  <AppVersion>16.0000</AppVersion>
+</Properties>
+</file>
+
+<file path=docProps\core.xml><?xml version="1.0" encoding="utf-8"?>
+<cp:coreProperties xmlns:cp="http://schemas.openxmlformats.org/package/2006/metadata/core-properties" xmlns:dc="http://purl.org/dc/elements/1.1/" xmlns:dcterms="http://purl.org/dc/terms/" xmlns:dcmitype="http://purl.org/dc/dcmitype/" xmlns:xsi="http://www.w3.org/2001/XMLSchema-instance">
+  <dc:title/>
+  <dc:subject/>
+  <dc:creator>Administrator</dc:creator>
+  <cp:keywords/>
+  <dc:description/>
+  <cp:lastModifiedBy>Administrator</cp:lastModifiedBy>
+  <cp:revision>25</cp:revision>
+  <dcterms:created xsi:type="dcterms:W3CDTF">2025-12-26T02:28:00Z</dcterms:created>
+  <dcterms:modified xsi:type="dcterms:W3CDTF">2026-07-08T10:24:00Z</dcterms:modified>
+</cp:coreProperties>
+</file>
+
+<file path=word\document.xml><?xml version="1.0" encoding="utf-8"?>
 <w:document xmlns:wpc="http://schemas.microsoft.com/office/word/2010/wordprocessingCanvas" xmlns:cx="http://schemas.microsoft.com/office/drawing/2014/chartex" xmlns:cx1="http://schemas.microsoft.com/office/drawing/2015/9/8/chartex" xmlns:cx2="http://schemas.microsoft.com/office/drawing/2015/10/21/chartex" xmlns:cx3="http://schemas.microsoft.com/office/drawing/2016/5/9/chartex" xmlns:cx4="http://schemas.microsoft.com/office/drawing/2016/5/10/chartex" xmlns:cx5="http://schemas.microsoft.com/office/drawing/2016/5/11/chartex" xmlns:cx6="http://schemas.microsoft.com/office/drawing/2016/5/12/chartex" xmlns:cx7="http://schemas.microsoft.com/office/drawing/2016/5/13/chartex" xmlns:cx8="http://schemas.microsoft.com/office/drawing/2016/5/14/chartex" xmlns:mc="http://schemas.openxmlformats.org/markup-compatibility/2006" xmlns:aink="http://schemas.microsoft.com/office/drawing/2016/ink" xmlns:am3d="http://schemas.microsoft.com/office/drawing/2017/model3d" xmlns:o="urn:schemas-microsoft-com:office:office" xmlns:r="http://schemas.openxmlformats.org/officeDocument/2006/relationships" xmlns:m="http://schemas.openxmlformats.org/officeDocument/2006/math" xmlns:v="urn:schemas-microsoft-com:vml" xmlns:wp14="http://schemas.microsoft.com/office/word/2010/wordprocessingDrawing" xmlns:wp="http://schemas.openxmlformats.org/drawingml/2006/wordprocessingDrawing" xmlns:w10="urn:schemas-microsoft-com:office:word" xmlns:w="http://schemas.openxmlformats.org/wordprocessingml/2006/main" xmlns:w14="http://schemas.microsoft.com/office/word/2010/wordml" xmlns:w15="http://schemas.microsoft.com/office/word/2012/wordml" xmlns:w16cid="http://schemas.microsoft.com/office/word/2016/wordml/cid" xmlns:w16se="http://schemas.microsoft.com/office/word/2015/wordml/symex" xmlns:wpg="http://schemas.microsoft.com/office/word/2010/wordprocessingGroup" xmlns:wpi="http://schemas.microsoft.com/office/word/2010/wordprocessingInk" xmlns:wne="http://schemas.microsoft.com/office/word/2006/wordml" xmlns:wps="http://schemas.microsoft.com/office/word/2010/wordprocessingShape" mc:Ignorable="w14 w15 w16se w16cid wp14">
   <w:body>
     <w:p>
@@ -179,7 +229,7 @@
           <w:sz w:val="26"/>
           <w:szCs w:val="26"/>
         </w:rPr>
-        <w:t xml:space="preserve"> [Niêm Yết], tỉnh Ninh Bình.</w:t>
+        <w:t xml:space="preserve"> {{niemyet}}, tỉnh Ninh Bình.</w:t>
       </w:r>
       <w:r>
         <w:rPr>
@@ -221,7 +271,7 @@
           <w:szCs w:val="26"/>
           <w:lang w:val="pt-BR"/>
         </w:rPr>
-        <w:t>[Tên 3];</w:t>
+        <w:t>{{ten3}};</w:t>
       </w:r>
       <w:r>
         <w:rPr>
@@ -230,7 +280,7 @@
           <w:lang w:val="pt-BR"/>
         </w:rPr>
         <w:tab/>
-        <w:t>Sinh ngày: [Năm sinh 3];</w:t>
+        <w:t>Sinh ngày: {{namsinh3}};</w:t>
       </w:r>
     </w:p>
     <w:p>
@@ -248,7 +298,7 @@
           <w:szCs w:val="26"/>
           <w:lang w:val="pt-BR"/>
         </w:rPr>
-        <w:t>[Loại CC 3] số: [CCCD 3] do [Nơi cấp CC 3] cấp ngày [Ngày cấp 3];</w:t>
+        <w:t>{{loaicc3}} số: {{cccd3}} do {{noicapcc3}} cấp ngày {{ngaycap3}};</w:t>
       </w:r>
     </w:p>
     <w:p>
@@ -266,7 +316,7 @@
           <w:szCs w:val="26"/>
           <w:lang w:val="pt-BR"/>
         </w:rPr>
-        <w:t>[Thường trú 3]: [Địa chỉ 3].</w:t>
+        <w:t>{{thuongtru3}}: {{diachi3}}.</w:t>
       </w:r>
     </w:p>
     <w:p>
@@ -300,7 +350,7 @@
           <w:sz w:val="26"/>
           <w:szCs w:val="26"/>
         </w:rPr>
-        <w:t>[Tên 1]</w:t>
+        <w:t>{{ten1}}</w:t>
       </w:r>
       <w:r>
         <w:rPr>
@@ -316,7 +366,7 @@
           <w:szCs w:val="26"/>
           <w:lang w:val="pt-BR"/>
         </w:rPr>
-        <w:t>[Tên 2].</w:t>
+        <w:t>{{ten2}}.</w:t>
       </w:r>
     </w:p>
     <w:bookmarkEnd w:id="0"/>
@@ -480,15 +530,15 @@
           <w:szCs w:val="26"/>
           <w:lang w:val="pt-BR"/>
         </w:rPr>
-        <w:t>[Tên 1]</w:t>
-      </w:r>
-      <w:r>
-        <w:rPr>
-          <w:sz w:val="26"/>
-          <w:szCs w:val="26"/>
-          <w:lang w:val="pt-BR"/>
-        </w:rPr>
-        <w:t xml:space="preserve">; Sinh năm: [Năm sinh 1]; chết ngày </w:t>
+        <w:t>{{ten1}}</w:t>
+      </w:r>
+      <w:r>
+        <w:rPr>
+          <w:sz w:val="26"/>
+          <w:szCs w:val="26"/>
+          <w:lang w:val="pt-BR"/>
+        </w:rPr>
+        <w:t xml:space="preserve">; Sinh năm: {{namsinh1}}; chết ngày </w:t>
       </w:r>
       <w:r>
         <w:rPr>
@@ -496,15 +546,15 @@
           <w:sz w:val="26"/>
           <w:szCs w:val="26"/>
         </w:rPr>
-        <w:t>[Năm chết]</w:t>
-      </w:r>
-      <w:r>
-        <w:rPr>
-          <w:sz w:val="26"/>
-          <w:szCs w:val="26"/>
-          <w:lang w:val="pt-BR"/>
-        </w:rPr>
-        <w:t xml:space="preserve"> theo Trích lục khai tử (Bản sao) số [CCCD 1] do Ủy ban nhân dân xã [Niêm Yết], tỉnh Ninh Bình ký ngày </w:t>
+        <w:t>{{namchet1}}</w:t>
+      </w:r>
+      <w:r>
+        <w:rPr>
+          <w:sz w:val="26"/>
+          <w:szCs w:val="26"/>
+          <w:lang w:val="pt-BR"/>
+        </w:rPr>
+        <w:t xml:space="preserve"> theo Trích lục khai tử (Bản sao) số {{cccd1}} do Ủy ban nhân dân xã {{niemyet}}, tỉnh Ninh Bình ký ngày </w:t>
       </w:r>
       <w:r>
         <w:rPr>
@@ -512,15 +562,15 @@
           <w:sz w:val="26"/>
           <w:szCs w:val="26"/>
         </w:rPr>
-        <w:t>[Ngày cấp 1]</w:t>
-      </w:r>
-      <w:r>
-        <w:rPr>
-          <w:sz w:val="26"/>
-          <w:szCs w:val="26"/>
-          <w:lang w:val="pt-BR"/>
-        </w:rPr>
-        <w:t xml:space="preserve">. Nơi chết: [Địa chỉ 1]. </w:t>
+        <w:t>{{ngaycap1}}</w:t>
+      </w:r>
+      <w:r>
+        <w:rPr>
+          <w:sz w:val="26"/>
+          <w:szCs w:val="26"/>
+          <w:lang w:val="pt-BR"/>
+        </w:rPr>
+        <w:t xml:space="preserve">. Nơi chết: {{diachi1}}. </w:t>
       </w:r>
     </w:p>
     <w:p>
@@ -550,15 +600,15 @@
           <w:szCs w:val="26"/>
           <w:lang w:val="pt-BR"/>
         </w:rPr>
-        <w:t>[Tên 2]</w:t>
-      </w:r>
-      <w:r>
-        <w:rPr>
-          <w:sz w:val="26"/>
-          <w:szCs w:val="26"/>
-          <w:lang w:val="pt-BR"/>
-        </w:rPr>
-        <w:t xml:space="preserve">; Sinh năm: [Năm sinh 2]; chết ngày </w:t>
+        <w:t>{{ten2}}</w:t>
+      </w:r>
+      <w:r>
+        <w:rPr>
+          <w:sz w:val="26"/>
+          <w:szCs w:val="26"/>
+          <w:lang w:val="pt-BR"/>
+        </w:rPr>
+        <w:t xml:space="preserve">; Sinh năm: {{namsinh2}}; chết ngày </w:t>
       </w:r>
       <w:r>
         <w:rPr>
@@ -566,31 +616,31 @@
           <w:sz w:val="26"/>
           <w:szCs w:val="26"/>
         </w:rPr>
-        <w:t xml:space="preserve">[Năm chết 2] </w:t>
-      </w:r>
-      <w:r>
-        <w:rPr>
-          <w:sz w:val="26"/>
-          <w:szCs w:val="26"/>
-          <w:lang w:val="pt-BR"/>
-        </w:rPr>
-        <w:t xml:space="preserve">theo Trích lục khai tử (Bản sao) số [CCCD 2] do Ủy ban nhân dân xã [Niêm Yết], tỉnh Ninh Bình ký ngày </w:t>
-      </w:r>
-      <w:r>
-        <w:rPr>
-          <w:sz w:val="26"/>
-          <w:szCs w:val="26"/>
-          <w:lang w:val="pt-BR"/>
-        </w:rPr>
-        <w:t>[Ngày cấp 2]</w:t>
-      </w:r>
-      <w:r>
-        <w:rPr>
-          <w:sz w:val="26"/>
-          <w:szCs w:val="26"/>
-          <w:lang w:val="pt-BR"/>
-        </w:rPr>
-        <w:t>. Nơi chết: [Địa chỉ 2].</w:t>
+        <w:t xml:space="preserve">{{namchet2}} </w:t>
+      </w:r>
+      <w:r>
+        <w:rPr>
+          <w:sz w:val="26"/>
+          <w:szCs w:val="26"/>
+          <w:lang w:val="pt-BR"/>
+        </w:rPr>
+        <w:t xml:space="preserve">theo Trích lục khai tử (Bản sao) số {{cccd2}} do Ủy ban nhân dân xã {{niemyet}}, tỉnh Ninh Bình ký ngày </w:t>
+      </w:r>
+      <w:r>
+        <w:rPr>
+          <w:sz w:val="26"/>
+          <w:szCs w:val="26"/>
+          <w:lang w:val="pt-BR"/>
+        </w:rPr>
+        <w:t>{{ngaycap2}}</w:t>
+      </w:r>
+      <w:r>
+        <w:rPr>
+          <w:sz w:val="26"/>
+          <w:szCs w:val="26"/>
+          <w:lang w:val="pt-BR"/>
+        </w:rPr>
+        <w:t>. Nơi chết: {{diachi2}}.</w:t>
       </w:r>
     </w:p>
     <w:p>
@@ -630,15 +680,15 @@
           <w:sz w:val="26"/>
           <w:szCs w:val="26"/>
         </w:rPr>
-        <w:t xml:space="preserve">[Tên 1] và bà </w:t>
-      </w:r>
-      <w:r>
-        <w:rPr>
-          <w:sz w:val="26"/>
-          <w:szCs w:val="26"/>
-          <w:lang w:val="pt-BR"/>
-        </w:rPr>
-        <w:t>[Tên 2]</w:t>
+        <w:t xml:space="preserve">{{ten1}} và bà </w:t>
+      </w:r>
+      <w:r>
+        <w:rPr>
+          <w:sz w:val="26"/>
+          <w:szCs w:val="26"/>
+          <w:lang w:val="pt-BR"/>
+        </w:rPr>
+        <w:t>{{ten2}}</w:t>
       </w:r>
       <w:r>
         <w:rPr>
@@ -717,15 +767,15 @@
           <w:sz w:val="26"/>
           <w:szCs w:val="26"/>
         </w:rPr>
-        <w:t xml:space="preserve">[Tên 1] và bà </w:t>
-      </w:r>
-      <w:r>
-        <w:rPr>
-          <w:sz w:val="26"/>
-          <w:szCs w:val="26"/>
-          <w:lang w:val="pt-BR"/>
-        </w:rPr>
-        <w:t>[Tên 2]</w:t>
+        <w:t xml:space="preserve">{{ten1}} và bà </w:t>
+      </w:r>
+      <w:r>
+        <w:rPr>
+          <w:sz w:val="26"/>
+          <w:szCs w:val="26"/>
+          <w:lang w:val="pt-BR"/>
+        </w:rPr>
+        <w:t>{{ten2}}</w:t>
       </w:r>
       <w:r>
         <w:rPr>
@@ -749,7 +799,7 @@
           <w:sz w:val="26"/>
           <w:szCs w:val="26"/>
         </w:rPr>
-        <w:t>[Địa chỉ đất]</w:t>
+        <w:t>{{diachidat1}}</w:t>
       </w:r>
       <w:r>
         <w:rPr>
@@ -776,7 +826,7 @@
           <w:szCs w:val="26"/>
           <w:lang w:val="nl-NL"/>
         </w:rPr>
-        <w:t xml:space="preserve">[Loại sổ] </w:t>
+        <w:t xml:space="preserve">{{loaiso1}} </w:t>
       </w:r>
       <w:r>
         <w:rPr>
@@ -795,7 +845,7 @@
           <w:szCs w:val="26"/>
           <w:lang w:val="nl-NL"/>
         </w:rPr>
-        <w:t>[Serial]</w:t>
+        <w:t>{{serial1}}</w:t>
       </w:r>
       <w:r>
         <w:rPr>
@@ -814,7 +864,7 @@
           <w:szCs w:val="26"/>
           <w:lang w:val="nl-NL"/>
         </w:rPr>
-        <w:t>[Số vào sổ]</w:t>
+        <w:t>{{sovaoso1}}</w:t>
       </w:r>
       <w:r>
         <w:rPr>
@@ -833,7 +883,7 @@
           <w:szCs w:val="26"/>
           <w:lang w:val="nl-NL"/>
         </w:rPr>
-        <w:t>[Cơ quan cấp sổ]</w:t>
+        <w:t>{{coquancapso1}}</w:t>
       </w:r>
       <w:r>
         <w:rPr>
@@ -852,7 +902,7 @@
           <w:szCs w:val="26"/>
           <w:lang w:val="nl-NL"/>
         </w:rPr>
-        <w:t>[Ngày cấp sổ]</w:t>
+        <w:t>{{ngaycapso1}}</w:t>
       </w:r>
       <w:r>
         <w:rPr>
@@ -897,7 +947,7 @@
           <w:szCs w:val="26"/>
           <w:lang w:val="nl-NL"/>
         </w:rPr>
-        <w:t>[Số thửa]</w:t>
+        <w:t>{{sothua1}}</w:t>
       </w:r>
       <w:r>
         <w:rPr>
@@ -916,7 +966,7 @@
           <w:szCs w:val="26"/>
           <w:lang w:val="nl-NL"/>
         </w:rPr>
-        <w:t>[Số tờ]</w:t>
+        <w:t>{{soto1}}</w:t>
       </w:r>
     </w:p>
     <w:p>
@@ -951,7 +1001,7 @@
           <w:szCs w:val="26"/>
           <w:lang w:val="nl-NL"/>
         </w:rPr>
-        <w:t>[Diện tích]</w:t>
+        <w:t>{{dientich1}}</w:t>
       </w:r>
       <w:r>
         <w:rPr>
@@ -1005,7 +1055,7 @@
           <w:szCs w:val="26"/>
           <w:lang w:val="nl-NL"/>
         </w:rPr>
-        <w:t>Hình thức sử dụng: [Hình thức sử dụng]</w:t>
+        <w:t>Hình thức sử dụng: {{hinhthucsudung1}}</w:t>
       </w:r>
     </w:p>
     <w:p>
@@ -1029,7 +1079,7 @@
           <w:szCs w:val="26"/>
           <w:lang w:val="nl-NL"/>
         </w:rPr>
-        <w:t>Mục đích sử dụng: ONT: [ONT] m</w:t>
+        <w:t>Mục đích sử dụng: ONT: {{ont1}} m</w:t>
       </w:r>
       <w:r>
         <w:rPr>
@@ -1048,7 +1098,7 @@
           <w:szCs w:val="26"/>
           <w:lang w:val="nl-NL"/>
         </w:rPr>
-        <w:t>; CLN: [CLN] m</w:t>
+        <w:t>; CLN: {{cln1}} m</w:t>
       </w:r>
       <w:r>
         <w:rPr>
@@ -1067,7 +1117,7 @@
           <w:szCs w:val="26"/>
           <w:lang w:val="nl-NL"/>
         </w:rPr>
-        <w:t>; NTS: [NTS] m</w:t>
+        <w:t>; NTS: {{nts1}} m</w:t>
       </w:r>
       <w:r>
         <w:rPr>
@@ -1120,7 +1170,7 @@
           <w:szCs w:val="26"/>
           <w:lang w:val="nl-NL"/>
         </w:rPr>
-        <w:t>[Thời hạn 1]</w:t>
+        <w:t>{{thoihan1}}</w:t>
       </w:r>
     </w:p>
     <w:p>
@@ -1156,7 +1206,7 @@
           <w:szCs w:val="26"/>
           <w:lang w:val="nl-NL"/>
         </w:rPr>
-        <w:t>[Nguồn gốc]</w:t>
+        <w:t>{{nguongoc1}}</w:t>
       </w:r>
       <w:r>
         <w:rPr>
@@ -1265,16 +1315,16 @@
           <w:sz w:val="26"/>
           <w:szCs w:val="26"/>
         </w:rPr>
-        <w:t xml:space="preserve">[Tên 1] và bà </w:t>
-      </w:r>
-      <w:r>
-        <w:rPr>
-          <w:b/>
-          <w:sz w:val="26"/>
-          <w:szCs w:val="26"/>
-          <w:lang w:val="pt-BR"/>
-        </w:rPr>
-        <w:t>[Tên 2]</w:t>
+        <w:t xml:space="preserve">{{ten1}} và bà </w:t>
+      </w:r>
+      <w:r>
+        <w:rPr>
+          <w:b/>
+          <w:sz w:val="26"/>
+          <w:szCs w:val="26"/>
+          <w:lang w:val="pt-BR"/>
+        </w:rPr>
+        <w:t>{{ten2}}</w:t>
       </w:r>
     </w:p>
     <w:p>
@@ -1331,15 +1381,15 @@
           <w:sz w:val="26"/>
           <w:szCs w:val="26"/>
         </w:rPr>
-        <w:t xml:space="preserve">[Tên 1] và bà </w:t>
-      </w:r>
-      <w:r>
-        <w:rPr>
-          <w:sz w:val="26"/>
-          <w:szCs w:val="26"/>
-          <w:lang w:val="pt-BR"/>
-        </w:rPr>
-        <w:t>[Tên 2]</w:t>
+        <w:t xml:space="preserve">{{ten1}} và bà </w:t>
+      </w:r>
+      <w:r>
+        <w:rPr>
+          <w:sz w:val="26"/>
+          <w:szCs w:val="26"/>
+          <w:lang w:val="pt-BR"/>
+        </w:rPr>
+        <w:t>{{ten2}}</w:t>
       </w:r>
       <w:r>
         <w:rPr>
@@ -1354,15 +1404,15 @@
           <w:sz w:val="26"/>
           <w:szCs w:val="26"/>
         </w:rPr>
-        <w:t xml:space="preserve">[Tên 1] và bà </w:t>
-      </w:r>
-      <w:r>
-        <w:rPr>
-          <w:sz w:val="26"/>
-          <w:szCs w:val="26"/>
-          <w:lang w:val="pt-BR"/>
-        </w:rPr>
-        <w:t>[Tên 2]</w:t>
+        <w:t xml:space="preserve">{{ten1}} và bà </w:t>
+      </w:r>
+      <w:r>
+        <w:rPr>
+          <w:sz w:val="26"/>
+          <w:szCs w:val="26"/>
+          <w:lang w:val="pt-BR"/>
+        </w:rPr>
+        <w:t>{{ten2}}</w:t>
       </w:r>
       <w:r>
         <w:rPr>
@@ -1392,15 +1442,15 @@
           <w:sz w:val="26"/>
           <w:szCs w:val="26"/>
         </w:rPr>
-        <w:t xml:space="preserve">[Tên 1] và bà </w:t>
-      </w:r>
-      <w:r>
-        <w:rPr>
-          <w:sz w:val="26"/>
-          <w:szCs w:val="26"/>
-          <w:lang w:val="pt-BR"/>
-        </w:rPr>
-        <w:t>[Tên 2]</w:t>
+        <w:t xml:space="preserve">{{ten1}} và bà </w:t>
+      </w:r>
+      <w:r>
+        <w:rPr>
+          <w:sz w:val="26"/>
+          <w:szCs w:val="26"/>
+          <w:lang w:val="pt-BR"/>
+        </w:rPr>
+        <w:t>{{ten2}}</w:t>
       </w:r>
       <w:r>
         <w:rPr>
@@ -1415,15 +1465,15 @@
           <w:sz w:val="26"/>
           <w:szCs w:val="26"/>
         </w:rPr>
-        <w:t xml:space="preserve">[Tên 1] và bà </w:t>
-      </w:r>
-      <w:r>
-        <w:rPr>
-          <w:sz w:val="26"/>
-          <w:szCs w:val="26"/>
-          <w:lang w:val="pt-BR"/>
-        </w:rPr>
-        <w:t>[Tên 2]</w:t>
+        <w:t xml:space="preserve">{{ten1}} và bà </w:t>
+      </w:r>
+      <w:r>
+        <w:rPr>
+          <w:sz w:val="26"/>
+          <w:szCs w:val="26"/>
+          <w:lang w:val="pt-BR"/>
+        </w:rPr>
+        <w:t>{{ten2}}</w:t>
       </w:r>
       <w:r>
         <w:rPr>
@@ -1465,15 +1515,15 @@
           <w:sz w:val="26"/>
           <w:szCs w:val="26"/>
         </w:rPr>
-        <w:t xml:space="preserve">[Tên 1] và bà </w:t>
-      </w:r>
-      <w:r>
-        <w:rPr>
-          <w:sz w:val="26"/>
-          <w:szCs w:val="26"/>
-          <w:lang w:val="pt-BR"/>
-        </w:rPr>
-        <w:t>[Tên 2]</w:t>
+        <w:t xml:space="preserve">{{ten1}} và bà </w:t>
+      </w:r>
+      <w:r>
+        <w:rPr>
+          <w:sz w:val="26"/>
+          <w:szCs w:val="26"/>
+          <w:lang w:val="pt-BR"/>
+        </w:rPr>
+        <w:t>{{ten2}}</w:t>
       </w:r>
       <w:r>
         <w:rPr>
@@ -1536,16 +1586,16 @@
           <w:sz w:val="26"/>
           <w:szCs w:val="26"/>
         </w:rPr>
-        <w:t xml:space="preserve">[Tên 1] và bà </w:t>
-      </w:r>
-      <w:r>
-        <w:rPr>
-          <w:b/>
-          <w:sz w:val="26"/>
-          <w:szCs w:val="26"/>
-          <w:lang w:val="pt-BR"/>
-        </w:rPr>
-        <w:t>[Tên 2]</w:t>
+        <w:t xml:space="preserve">{{ten1}} và bà </w:t>
+      </w:r>
+      <w:r>
+        <w:rPr>
+          <w:b/>
+          <w:sz w:val="26"/>
+          <w:szCs w:val="26"/>
+          <w:lang w:val="pt-BR"/>
+        </w:rPr>
+        <w:t>{{ten2}}</w:t>
       </w:r>
     </w:p>
     <w:p>
@@ -1563,7 +1613,7 @@
           <w:sz w:val="26"/>
           <w:szCs w:val="26"/>
         </w:rPr>
-        <w:t>Khi còn sống, ông [Tên 1] và bà [Tên 2] là vợ chồng</w:t>
+        <w:t>Khi còn sống, ông {{ten1}} và bà {{ten2}} là vợ chồng</w:t>
       </w:r>
       <w:r>
         <w:rPr>
@@ -1585,15 +1635,15 @@
           <w:sz w:val="26"/>
           <w:szCs w:val="26"/>
         </w:rPr>
-        <w:t xml:space="preserve">[Tên 1] và bà </w:t>
-      </w:r>
-      <w:r>
-        <w:rPr>
-          <w:sz w:val="26"/>
-          <w:szCs w:val="26"/>
-          <w:lang w:val="pt-BR"/>
-        </w:rPr>
-        <w:t xml:space="preserve">[Tên 2] có </w:t>
+        <w:t xml:space="preserve">{{ten1}} và bà </w:t>
+      </w:r>
+      <w:r>
+        <w:rPr>
+          <w:sz w:val="26"/>
+          <w:szCs w:val="26"/>
+          <w:lang w:val="pt-BR"/>
+        </w:rPr>
+        <w:t xml:space="preserve">{{ten2}} có </w:t>
       </w:r>
       <w:r>
         <w:rPr>
@@ -1657,7 +1707,7 @@
           <w:szCs w:val="26"/>
           <w:lang w:val="pt-BR"/>
         </w:rPr>
-        <w:t xml:space="preserve">bà: [Tên 1]; </w:t>
+        <w:t xml:space="preserve">bà: {{ten1}}; </w:t>
       </w:r>
     </w:p>
     <w:p>
@@ -1681,7 +1731,7 @@
           <w:lang w:val="pt-BR"/>
         </w:rPr>
         <w:lastRenderedPageBreak/>
-        <w:t>Ông/bà: [Tên 2];</w:t>
+        <w:t>Ông/bà: {{ten2}};</w:t>
       </w:r>
     </w:p>
     <w:p>
@@ -1704,7 +1754,7 @@
           <w:szCs w:val="26"/>
           <w:lang w:val="pt-BR"/>
         </w:rPr>
-        <w:t>Ông/bà: [Tên 3];</w:t>
+        <w:t>Ông/bà: {{ten3}};</w:t>
       </w:r>
     </w:p>
     <w:p>
@@ -1727,7 +1777,7 @@
           <w:szCs w:val="26"/>
           <w:lang w:val="pt-BR"/>
         </w:rPr>
-        <w:t>Ông/bà: [Tên 4];</w:t>
+        <w:t>Ông/bà: {{ten4}};</w:t>
       </w:r>
     </w:p>
     <w:p>
@@ -1750,7 +1800,7 @@
           <w:szCs w:val="26"/>
           <w:lang w:val="pt-BR"/>
         </w:rPr>
-        <w:t>Ông/bà: [Tên 5];</w:t>
+        <w:t>Ông/bà: {{ten5}};</w:t>
       </w:r>
     </w:p>
     <w:p>
@@ -1773,7 +1823,7 @@
           <w:szCs w:val="26"/>
           <w:lang w:val="pt-BR"/>
         </w:rPr>
-        <w:t>Ông/bà: [Tên 6];</w:t>
+        <w:t>Ông/bà: {{ten6}};</w:t>
       </w:r>
     </w:p>
     <w:p>
@@ -1796,7 +1846,7 @@
           <w:szCs w:val="26"/>
           <w:lang w:val="pt-BR"/>
         </w:rPr>
-        <w:t>Ông/bà: [Tên 7];</w:t>
+        <w:t>Ông/bà: {{ten7}};</w:t>
       </w:r>
     </w:p>
     <w:p>
@@ -1819,7 +1869,7 @@
           <w:szCs w:val="26"/>
           <w:lang w:val="pt-BR"/>
         </w:rPr>
-        <w:t>Ông/bà: [Tên 8];</w:t>
+        <w:t>Ông/bà: {{ten8}};</w:t>
       </w:r>
     </w:p>
     <w:p>
@@ -1842,7 +1892,7 @@
           <w:szCs w:val="26"/>
           <w:lang w:val="pt-BR"/>
         </w:rPr>
-        <w:t>Ông/bà: [Tên 9];</w:t>
+        <w:t>Ông/bà: {{ten9}};</w:t>
       </w:r>
     </w:p>
     <w:p>
@@ -1864,7 +1914,7 @@
           <w:szCs w:val="26"/>
           <w:lang w:val="pt-BR"/>
         </w:rPr>
-        <w:t>Ông/bà: [Tên 10];</w:t>
+        <w:t>Ông/bà: {{ten10}};</w:t>
       </w:r>
     </w:p>
     <w:p>
@@ -1892,7 +1942,7 @@
           <w:sz w:val="26"/>
           <w:szCs w:val="26"/>
         </w:rPr>
-        <w:t>[Tên 1]; [Tên 2]; [Tên 3]; [Tên 4]; [Tên 5]; [Tên 6]; [Tên 7]; [Tên 8]; [Tên 9];</w:t>
+        <w:t>{{ten1}}; {{ten2}}; {{ten3}}; {{ten4}}; {{ten5}}; {{ten6}}; {{ten7}}; {{ten8}}; {{ten9}};</w:t>
       </w:r>
       <w:r>
         <w:rPr>
@@ -1908,7 +1958,7 @@
           <w:sz w:val="26"/>
           <w:szCs w:val="26"/>
         </w:rPr>
-        <w:t>[Tên 10]</w:t>
+        <w:t>{{ten10}}</w:t>
       </w:r>
       <w:r>
         <w:rPr>
@@ -1957,15 +2007,15 @@
           <w:sz w:val="26"/>
           <w:szCs w:val="26"/>
         </w:rPr>
-        <w:t xml:space="preserve">[Tên 1] và bà </w:t>
-      </w:r>
-      <w:r>
-        <w:rPr>
-          <w:sz w:val="26"/>
-          <w:szCs w:val="26"/>
-          <w:lang w:val="pt-BR"/>
-        </w:rPr>
-        <w:t>[Tên 2]</w:t>
+        <w:t xml:space="preserve">{{ten1}} và bà </w:t>
+      </w:r>
+      <w:r>
+        <w:rPr>
+          <w:sz w:val="26"/>
+          <w:szCs w:val="26"/>
+          <w:lang w:val="pt-BR"/>
+        </w:rPr>
+        <w:t>{{ten2}}</w:t>
       </w:r>
       <w:r>
         <w:rPr>
@@ -2117,7 +2167,7 @@
           <w:sz w:val="26"/>
           <w:szCs w:val="26"/>
         </w:rPr>
-        <w:t>[Niêm Yết]</w:t>
+        <w:t>{{niemyet}}</w:t>
       </w:r>
       <w:r>
         <w:rPr>
@@ -2159,15 +2209,15 @@
           <w:sz w:val="26"/>
           <w:szCs w:val="26"/>
         </w:rPr>
-        <w:t xml:space="preserve">[Tên 1] và bà </w:t>
-      </w:r>
-      <w:r>
-        <w:rPr>
-          <w:sz w:val="26"/>
-          <w:szCs w:val="26"/>
-          <w:lang w:val="pt-BR"/>
-        </w:rPr>
-        <w:t>[Tên 2]</w:t>
+        <w:t xml:space="preserve">{{ten1}} và bà </w:t>
+      </w:r>
+      <w:r>
+        <w:rPr>
+          <w:sz w:val="26"/>
+          <w:szCs w:val="26"/>
+          <w:lang w:val="pt-BR"/>
+        </w:rPr>
+        <w:t>{{ten2}}</w:t>
       </w:r>
       <w:r>
         <w:rPr>
@@ -2207,7 +2257,7 @@
           <w:sz w:val="26"/>
           <w:szCs w:val="26"/>
         </w:rPr>
-        <w:t>[Niêm Yết]</w:t>
+        <w:t>{{niemyet}}</w:t>
       </w:r>
       <w:r>
         <w:rPr>
@@ -2264,15 +2314,15 @@
           <w:sz w:val="26"/>
           <w:szCs w:val="26"/>
         </w:rPr>
-        <w:t xml:space="preserve">[Tên 1] và bà </w:t>
-      </w:r>
-      <w:r>
-        <w:rPr>
-          <w:sz w:val="26"/>
-          <w:szCs w:val="26"/>
-          <w:lang w:val="pt-BR"/>
-        </w:rPr>
-        <w:t>[Tên 2]</w:t>
+        <w:t xml:space="preserve">{{ten1}} và bà </w:t>
+      </w:r>
+      <w:r>
+        <w:rPr>
+          <w:sz w:val="26"/>
+          <w:szCs w:val="26"/>
+          <w:lang w:val="pt-BR"/>
+        </w:rPr>
+        <w:t>{{ten2}}</w:t>
       </w:r>
       <w:r>
         <w:rPr>
@@ -2333,7 +2383,7 @@
           <w:sz w:val="26"/>
           <w:szCs w:val="26"/>
         </w:rPr>
-        <w:t xml:space="preserve">[Tên 1] và bà </w:t>
+        <w:t xml:space="preserve">{{ten1}} và bà </w:t>
       </w:r>
       <w:r>
         <w:rPr>
@@ -2343,7 +2393,7 @@
           <w:szCs w:val="26"/>
           <w:lang w:val="pt-BR"/>
         </w:rPr>
-        <w:t>[Tên 2]</w:t>
+        <w:t>{{ten2}}</w:t>
       </w:r>
       <w:r>
         <w:rPr>
@@ -2384,7 +2434,7 @@
           <w:szCs w:val="26"/>
           <w:lang w:val="nl-NL"/>
         </w:rPr>
-        <w:t>[Tên 3]</w:t>
+        <w:t>{{ten3}}</w:t>
       </w:r>
       <w:r>
         <w:rPr>
@@ -2424,7 +2474,7 @@
           <w:sz w:val="26"/>
           <w:szCs w:val="26"/>
         </w:rPr>
-        <w:t xml:space="preserve">[Tên 1] và bà </w:t>
+        <w:t xml:space="preserve">{{ten1}} và bà </w:t>
       </w:r>
       <w:r>
         <w:rPr>
@@ -2434,7 +2484,7 @@
           <w:szCs w:val="26"/>
           <w:lang w:val="pt-BR"/>
         </w:rPr>
-        <w:t>[Tên 2]</w:t>
+        <w:t>{{ten2}}</w:t>
       </w:r>
       <w:r>
         <w:rPr>
@@ -2483,7 +2533,7 @@
           <w:sz w:val="26"/>
           <w:szCs w:val="26"/>
         </w:rPr>
-        <w:t xml:space="preserve">[Tên 1] và bà </w:t>
+        <w:t xml:space="preserve">{{ten1}} và bà </w:t>
       </w:r>
       <w:r>
         <w:rPr>
@@ -2493,7 +2543,7 @@
           <w:szCs w:val="26"/>
           <w:lang w:val="pt-BR"/>
         </w:rPr>
-        <w:t>[Tên 2]</w:t>
+        <w:t>{{ten2}}</w:t>
       </w:r>
       <w:r>
         <w:rPr>
@@ -2604,7 +2654,7 @@
           <w:szCs w:val="26"/>
           <w:lang w:val="nl-NL"/>
         </w:rPr>
-        <w:t>[Tên 3]</w:t>
+        <w:t>{{ten3}}</w:t>
       </w:r>
       <w:r>
         <w:rPr>
@@ -2671,7 +2721,7 @@
           <w:sz w:val="26"/>
           <w:szCs w:val="26"/>
         </w:rPr>
-        <w:t>ông [Tên 1] và bà [Tên 2]</w:t>
+        <w:t>ông {{ten1}} và bà {{ten2}}</w:t>
       </w:r>
       <w:r>
         <w:rPr>
@@ -2800,7 +2850,7 @@
           <w:szCs w:val="26"/>
           <w:lang w:val="nl-NL"/>
         </w:rPr>
-        <w:t xml:space="preserve">[Tên 3] </w:t>
+        <w:t xml:space="preserve">{{ten3}} </w:t>
       </w:r>
       <w:r>
         <w:rPr>
@@ -2867,7 +2917,7 @@
           <w:szCs w:val="26"/>
           <w:lang w:val="nl-NL"/>
         </w:rPr>
-        <w:t xml:space="preserve">[Tên 3] </w:t>
+        <w:t xml:space="preserve">{{ten3}} </w:t>
       </w:r>
       <w:r>
         <w:rPr>
@@ -2999,7 +3049,7 @@
           <w:sz w:val="26"/>
           <w:szCs w:val="26"/>
         </w:rPr>
-        <w:t>ng [Tên 1] và bà [Tên 2]</w:t>
+        <w:t>ng {{ten1}} và bà {{ten2}}</w:t>
       </w:r>
       <w:r>
         <w:rPr>
@@ -3085,7 +3135,7 @@
           <w:sz w:val="26"/>
           <w:szCs w:val="26"/>
         </w:rPr>
-        <w:t>ông [Tên 1] và bà [Tên 2]</w:t>
+        <w:t>ông {{ten1}} và bà {{ten2}}</w:t>
       </w:r>
       <w:r>
         <w:rPr>
@@ -3639,7 +3689,7 @@
           <w:sz w:val="26"/>
           <w:szCs w:val="26"/>
         </w:rPr>
-        <w:t>[Niêm Yết]</w:t>
+        <w:t>{{niemyet}}</w:t>
       </w:r>
       <w:r>
         <w:rPr>
@@ -3685,7 +3735,7 @@
           <w:sz w:val="26"/>
           <w:szCs w:val="26"/>
         </w:rPr>
-        <w:t>[Niêm Yết]</w:t>
+        <w:t>{{niemyet}}</w:t>
       </w:r>
       <w:r>
         <w:rPr>
@@ -3787,7 +3837,7 @@
           <w:szCs w:val="26"/>
           <w:lang w:val="pt-BR"/>
         </w:rPr>
-        <w:t>[Tên 3]</w:t>
+        <w:t>{{ten3}}</w:t>
       </w:r>
       <w:bookmarkEnd w:id="2"/>
       <w:r>
@@ -3806,7 +3856,7 @@
           <w:lang w:val="pt-BR"/>
         </w:rPr>
         <w:tab/>
-        <w:t>Sinh ngày: [Năm sinh 3];</w:t>
+        <w:t>Sinh ngày: {{namsinh3}};</w:t>
       </w:r>
     </w:p>
     <w:p>
@@ -3825,7 +3875,7 @@
           <w:szCs w:val="26"/>
           <w:lang w:val="pt-BR"/>
         </w:rPr>
-        <w:t>[Loại CC 3] số: [CCCD 3] do [Nơi cấp CC 3] cấp ngày [Ngày cấp 3];</w:t>
+        <w:t>{{loaicc3}} số: {{cccd3}} do {{noicapcc3}} cấp ngày {{ngaycap3}};</w:t>
       </w:r>
     </w:p>
     <w:bookmarkEnd w:id="1"/>
@@ -3864,7 +3914,7 @@
           <w:szCs w:val="26"/>
           <w:lang w:val="nl-NL"/>
         </w:rPr>
-        <w:t xml:space="preserve">[Tên 3] </w:t>
+        <w:t xml:space="preserve">{{ten3}} </w:t>
       </w:r>
       <w:r>
         <w:rPr>
@@ -3962,7 +4012,7 @@
           <w:szCs w:val="26"/>
           <w:lang w:val="nl-NL"/>
         </w:rPr>
-        <w:t xml:space="preserve">[Tên 3] </w:t>
+        <w:t xml:space="preserve">{{ten3}} </w:t>
       </w:r>
       <w:r>
         <w:rPr>
@@ -4166,7 +4216,7 @@
           <w:sz w:val="26"/>
           <w:szCs w:val="26"/>
         </w:rPr>
-        <w:t>[Niêm Yết]</w:t>
+        <w:t>{{niemyet}}</w:t>
       </w:r>
       <w:r>
         <w:rPr>
@@ -4615,7 +4665,7 @@
                 <w:sz w:val="26"/>
                 <w:szCs w:val="26"/>
               </w:rPr>
-              <w:t>Bố đẻ ông [Tên 1]</w:t>
+              <w:t>Bố đẻ ông {{ten1}}</w:t>
             </w:r>
           </w:p>
         </w:tc>
@@ -4723,7 +4773,7 @@
                 <w:sz w:val="26"/>
                 <w:szCs w:val="26"/>
               </w:rPr>
-              <w:t>Mẹ đẻ ông [Tên 1]</w:t>
+              <w:t>Mẹ đẻ ông {{ten1}}</w:t>
             </w:r>
           </w:p>
         </w:tc>
@@ -4825,7 +4875,7 @@
                 <w:sz w:val="26"/>
                 <w:szCs w:val="26"/>
               </w:rPr>
-              <w:t>Bố đẻ bà [Tên 2]</w:t>
+              <w:t>Bố đẻ bà {{ten2}}</w:t>
             </w:r>
           </w:p>
         </w:tc>
@@ -4927,7 +4977,7 @@
                 <w:sz w:val="26"/>
                 <w:szCs w:val="26"/>
               </w:rPr>
-              <w:t>Mẹ đẻ bà [Tên 2]</w:t>
+              <w:t>Mẹ đẻ bà {{ten2}}</w:t>
             </w:r>
           </w:p>
         </w:tc>
@@ -5029,7 +5079,7 @@
                 <w:sz w:val="26"/>
                 <w:szCs w:val="26"/>
               </w:rPr>
-              <w:t>[Tên 2]</w:t>
+              <w:t>{{ten2}}</w:t>
             </w:r>
           </w:p>
         </w:tc>
@@ -5051,7 +5101,7 @@
                 <w:sz w:val="26"/>
                 <w:szCs w:val="26"/>
               </w:rPr>
-              <w:t>[Năm sinh 2]</w:t>
+              <w:t>{{namsinh2}}</w:t>
             </w:r>
           </w:p>
         </w:tc>
@@ -5073,7 +5123,7 @@
                 <w:sz w:val="26"/>
                 <w:szCs w:val="26"/>
               </w:rPr>
-              <w:t>[Địa chỉ 2]</w:t>
+              <w:t>{{diachi2}}</w:t>
             </w:r>
           </w:p>
         </w:tc>
@@ -5144,7 +5194,7 @@
                 <w:sz w:val="26"/>
                 <w:szCs w:val="26"/>
               </w:rPr>
-              <w:t>[Tên 3]</w:t>
+              <w:t>{{ten3}}</w:t>
             </w:r>
           </w:p>
         </w:tc>
@@ -5166,7 +5216,7 @@
                 <w:sz w:val="26"/>
                 <w:szCs w:val="26"/>
               </w:rPr>
-              <w:t>[Năm sinh 3]</w:t>
+              <w:t>{{namsinh3}}</w:t>
             </w:r>
           </w:p>
         </w:tc>
@@ -5188,7 +5238,7 @@
                 <w:sz w:val="26"/>
                 <w:szCs w:val="26"/>
               </w:rPr>
-              <w:t>[Địa chỉ 3]</w:t>
+              <w:t>{{diachi3}}</w:t>
             </w:r>
           </w:p>
         </w:tc>
@@ -5259,7 +5309,7 @@
                 <w:sz w:val="26"/>
                 <w:szCs w:val="26"/>
               </w:rPr>
-              <w:t>[Tên 4]</w:t>
+              <w:t>{{ten4}}</w:t>
             </w:r>
           </w:p>
         </w:tc>
@@ -5281,7 +5331,7 @@
                 <w:sz w:val="26"/>
                 <w:szCs w:val="26"/>
               </w:rPr>
-              <w:t>[Năm sinh 4]</w:t>
+              <w:t>{{namsinh4}}</w:t>
             </w:r>
           </w:p>
         </w:tc>
@@ -5303,7 +5353,7 @@
                 <w:sz w:val="26"/>
                 <w:szCs w:val="26"/>
               </w:rPr>
-              <w:t>[Địa chỉ 4]</w:t>
+              <w:t>{{diachi4}}</w:t>
             </w:r>
           </w:p>
         </w:tc>
@@ -5374,7 +5424,7 @@
                 <w:sz w:val="26"/>
                 <w:szCs w:val="26"/>
               </w:rPr>
-              <w:t>[Tên 5]</w:t>
+              <w:t>{{ten5}}</w:t>
             </w:r>
           </w:p>
         </w:tc>
@@ -5396,7 +5446,7 @@
                 <w:sz w:val="26"/>
                 <w:szCs w:val="26"/>
               </w:rPr>
-              <w:t>[Năm sinh 5]</w:t>
+              <w:t>{{namsinh5}}</w:t>
             </w:r>
           </w:p>
         </w:tc>
@@ -5418,7 +5468,7 @@
                 <w:sz w:val="26"/>
                 <w:szCs w:val="26"/>
               </w:rPr>
-              <w:t>[Địa chỉ 5]</w:t>
+              <w:t>{{diachi5}}</w:t>
             </w:r>
           </w:p>
         </w:tc>
@@ -5495,7 +5545,7 @@
                 <w:sz w:val="26"/>
                 <w:szCs w:val="26"/>
               </w:rPr>
-              <w:t>[Tên 6]</w:t>
+              <w:t>{{ten6}}</w:t>
             </w:r>
           </w:p>
         </w:tc>
@@ -5520,7 +5570,7 @@
                 <w:sz w:val="26"/>
                 <w:szCs w:val="26"/>
               </w:rPr>
-              <w:t>[Năm sinh 6]</w:t>
+              <w:t>{{namsinh6}}</w:t>
             </w:r>
           </w:p>
         </w:tc>
@@ -5545,7 +5595,7 @@
                 <w:sz w:val="26"/>
                 <w:szCs w:val="26"/>
               </w:rPr>
-              <w:t>[Địa chỉ 6]</w:t>
+              <w:t>{{diachi6}}</w:t>
             </w:r>
           </w:p>
         </w:tc>
@@ -5619,7 +5669,7 @@
                 <w:sz w:val="26"/>
                 <w:szCs w:val="26"/>
               </w:rPr>
-              <w:t>[Tên 7]</w:t>
+              <w:t>{{ten7}}</w:t>
             </w:r>
           </w:p>
         </w:tc>
@@ -5641,7 +5691,7 @@
                 <w:sz w:val="26"/>
                 <w:szCs w:val="26"/>
               </w:rPr>
-              <w:t>[Năm sinh 7]</w:t>
+              <w:t>{{namsinh7}}</w:t>
             </w:r>
           </w:p>
         </w:tc>
@@ -5663,7 +5713,7 @@
                 <w:sz w:val="26"/>
                 <w:szCs w:val="26"/>
               </w:rPr>
-              <w:t>[Địa chỉ 7]</w:t>
+              <w:t>{{diachi7}}</w:t>
             </w:r>
           </w:p>
         </w:tc>
@@ -5727,7 +5777,7 @@
                 <w:sz w:val="26"/>
                 <w:szCs w:val="26"/>
               </w:rPr>
-              <w:t>[Tên 8]</w:t>
+              <w:t>{{ten8}}</w:t>
             </w:r>
           </w:p>
         </w:tc>
@@ -5749,7 +5799,7 @@
                 <w:sz w:val="26"/>
                 <w:szCs w:val="26"/>
               </w:rPr>
-              <w:t>[Năm sinh 8]</w:t>
+              <w:t>{{namsinh8}}</w:t>
             </w:r>
           </w:p>
         </w:tc>
@@ -5771,7 +5821,7 @@
                 <w:sz w:val="26"/>
                 <w:szCs w:val="26"/>
               </w:rPr>
-              <w:t>[Địa chỉ 8]</w:t>
+              <w:t>{{diachi8}}</w:t>
             </w:r>
           </w:p>
         </w:tc>
@@ -5841,7 +5891,7 @@
                 <w:sz w:val="26"/>
                 <w:szCs w:val="26"/>
               </w:rPr>
-              <w:t>[Tên 9]</w:t>
+              <w:t>{{ten9}}</w:t>
             </w:r>
           </w:p>
         </w:tc>
@@ -5866,7 +5916,7 @@
                 <w:sz w:val="26"/>
                 <w:szCs w:val="26"/>
               </w:rPr>
-              <w:t>[Năm sinh 9]</w:t>
+              <w:t>{{namsinh9}}</w:t>
             </w:r>
           </w:p>
         </w:tc>
@@ -5891,7 +5941,7 @@
                 <w:sz w:val="26"/>
                 <w:szCs w:val="26"/>
               </w:rPr>
-              <w:t>[Địa chỉ 9]</w:t>
+              <w:t>{{diachi9}}</w:t>
             </w:r>
           </w:p>
         </w:tc>
@@ -5963,7 +6013,7 @@
                 <w:sz w:val="26"/>
                 <w:szCs w:val="26"/>
               </w:rPr>
-              <w:t>[Tên 10]</w:t>
+              <w:t>{{ten10}}</w:t>
             </w:r>
           </w:p>
         </w:tc>
@@ -5988,7 +6038,7 @@
                 <w:sz w:val="26"/>
                 <w:szCs w:val="26"/>
               </w:rPr>
-              <w:t>[Năm sinh 10]</w:t>
+              <w:t>{{namsinh10}}</w:t>
             </w:r>
           </w:p>
         </w:tc>
@@ -6013,7 +6063,7 @@
                 <w:sz w:val="26"/>
                 <w:szCs w:val="26"/>
               </w:rPr>
-              <w:t>[Địa chỉ 10]</w:t>
+              <w:t>{{diachi10}}</w:t>
             </w:r>
           </w:p>
         </w:tc>
@@ -6310,7 +6360,54 @@
 </w:document>
 </file>
 
-<file path=word/numbering.xml><?xml version="1.0" encoding="utf-8"?>
+<file path=word\fontTable.xml><?xml version="1.0" encoding="utf-8"?>
+<w:fonts xmlns:mc="http://schemas.openxmlformats.org/markup-compatibility/2006" xmlns:r="http://schemas.openxmlformats.org/officeDocument/2006/relationships" xmlns:w="http://schemas.openxmlformats.org/wordprocessingml/2006/main" xmlns:w14="http://schemas.microsoft.com/office/word/2010/wordml" xmlns:w15="http://schemas.microsoft.com/office/word/2012/wordml" xmlns:w16cid="http://schemas.microsoft.com/office/word/2016/wordml/cid" xmlns:w16se="http://schemas.microsoft.com/office/word/2015/wordml/symex" mc:Ignorable="w14 w15 w16se w16cid">
+  <w:font w:name="Times New Roman">
+    <w:panose1 w:val="02020603050405020304"/>
+    <w:charset w:val="00"/>
+    <w:family w:val="roman"/>
+    <w:pitch w:val="variable"/>
+    <w:sig w:usb0="E0002EFF" w:usb1="C000785B" w:usb2="00000009" w:usb3="00000000" w:csb0="000001FF" w:csb1="00000000"/>
+  </w:font>
+  <w:font w:name="Courier New">
+    <w:panose1 w:val="02070309020205020404"/>
+    <w:charset w:val="00"/>
+    <w:family w:val="modern"/>
+    <w:pitch w:val="fixed"/>
+    <w:sig w:usb0="E0002EFF" w:usb1="C0007843" w:usb2="00000009" w:usb3="00000000" w:csb0="000001FF" w:csb1="00000000"/>
+  </w:font>
+  <w:font w:name="Wingdings">
+    <w:panose1 w:val="05000000000000000000"/>
+    <w:charset w:val="02"/>
+    <w:family w:val="auto"/>
+    <w:pitch w:val="variable"/>
+    <w:sig w:usb0="00000000" w:usb1="10000000" w:usb2="00000000" w:usb3="00000000" w:csb0="80000000" w:csb1="00000000"/>
+  </w:font>
+  <w:font w:name="Symbol">
+    <w:panose1 w:val="05050102010706020507"/>
+    <w:charset w:val="02"/>
+    <w:family w:val="roman"/>
+    <w:pitch w:val="variable"/>
+    <w:sig w:usb0="00000000" w:usb1="10000000" w:usb2="00000000" w:usb3="00000000" w:csb0="80000000" w:csb1="00000000"/>
+  </w:font>
+  <w:font w:name="Calibri">
+    <w:panose1 w:val="020F0502020204030204"/>
+    <w:charset w:val="00"/>
+    <w:family w:val="swiss"/>
+    <w:pitch w:val="variable"/>
+    <w:sig w:usb0="E4002EFF" w:usb1="C000247B" w:usb2="00000009" w:usb3="00000000" w:csb0="000001FF" w:csb1="00000000"/>
+  </w:font>
+  <w:font w:name="Calibri Light">
+    <w:panose1 w:val="020F0302020204030204"/>
+    <w:charset w:val="00"/>
+    <w:family w:val="swiss"/>
+    <w:pitch w:val="variable"/>
+    <w:sig w:usb0="E4002EFF" w:usb1="C000247B" w:usb2="00000009" w:usb3="00000000" w:csb0="000001FF" w:csb1="00000000"/>
+  </w:font>
+</w:fonts>
+</file>
+
+<file path=word\numbering.xml><?xml version="1.0" encoding="utf-8"?>
 <w:numbering xmlns:wpc="http://schemas.microsoft.com/office/word/2010/wordprocessingCanvas" xmlns:cx="http://schemas.microsoft.com/office/drawing/2014/chartex" xmlns:cx1="http://schemas.microsoft.com/office/drawing/2015/9/8/chartex" xmlns:cx2="http://schemas.microsoft.com/office/drawing/2015/10/21/chartex" xmlns:cx3="http://schemas.microsoft.com/office/drawing/2016/5/9/chartex" xmlns:cx4="http://schemas.microsoft.com/office/drawing/2016/5/10/chartex" xmlns:cx5="http://schemas.microsoft.com/office/drawing/2016/5/11/chartex" xmlns:cx6="http://schemas.microsoft.com/office/drawing/2016/5/12/chartex" xmlns:cx7="http://schemas.microsoft.com/office/drawing/2016/5/13/chartex" xmlns:cx8="http://schemas.microsoft.com/office/drawing/2016/5/14/chartex" xmlns:mc="http://schemas.openxmlformats.org/markup-compatibility/2006" xmlns:aink="http://schemas.microsoft.com/office/drawing/2016/ink" xmlns:am3d="http://schemas.microsoft.com/office/drawing/2017/model3d" xmlns:o="urn:schemas-microsoft-com:office:office" xmlns:r="http://schemas.openxmlformats.org/officeDocument/2006/relationships" xmlns:m="http://schemas.openxmlformats.org/officeDocument/2006/math" xmlns:v="urn:schemas-microsoft-com:vml" xmlns:wp14="http://schemas.microsoft.com/office/word/2010/wordprocessingDrawing" xmlns:wp="http://schemas.openxmlformats.org/drawingml/2006/wordprocessingDrawing" xmlns:w10="urn:schemas-microsoft-com:office:word" xmlns:w="http://schemas.openxmlformats.org/wordprocessingml/2006/main" xmlns:w14="http://schemas.microsoft.com/office/word/2010/wordml" xmlns:w15="http://schemas.microsoft.com/office/word/2012/wordml" xmlns:w16cid="http://schemas.microsoft.com/office/word/2016/wordml/cid" xmlns:w16se="http://schemas.microsoft.com/office/word/2015/wordml/symex" xmlns:wpg="http://schemas.microsoft.com/office/word/2010/wordprocessingGroup" xmlns:wpi="http://schemas.microsoft.com/office/word/2010/wordprocessingInk" xmlns:wne="http://schemas.microsoft.com/office/word/2006/wordml" xmlns:wps="http://schemas.microsoft.com/office/word/2010/wordprocessingShape" mc:Ignorable="w14 w15 w16se w16cid wp14">
   <w:abstractNum w:abstractNumId="0" w15:restartNumberingAfterBreak="0">
     <w:nsid w:val="015A013B"/>
@@ -6801,7 +6898,96 @@
 </w:numbering>
 </file>
 
-<file path=word/styles.xml><?xml version="1.0" encoding="utf-8"?>
+<file path=word\settings.xml><?xml version="1.0" encoding="utf-8"?>
+<w:settings xmlns:mc="http://schemas.openxmlformats.org/markup-compatibility/2006" xmlns:o="urn:schemas-microsoft-com:office:office" xmlns:r="http://schemas.openxmlformats.org/officeDocument/2006/relationships" xmlns:m="http://schemas.openxmlformats.org/officeDocument/2006/math" xmlns:v="urn:schemas-microsoft-com:vml" xmlns:w10="urn:schemas-microsoft-com:office:word" xmlns:w="http://schemas.openxmlformats.org/wordprocessingml/2006/main" xmlns:w14="http://schemas.microsoft.com/office/word/2010/wordml" xmlns:w15="http://schemas.microsoft.com/office/word/2012/wordml" xmlns:w16cid="http://schemas.microsoft.com/office/word/2016/wordml/cid" xmlns:w16se="http://schemas.microsoft.com/office/word/2015/wordml/symex" xmlns:sl="http://schemas.openxmlformats.org/schemaLibrary/2006/main" mc:Ignorable="w14 w15 w16se w16cid">
+  <w:zoom w:percent="116"/>
+  <w:defaultTabStop w:val="720"/>
+  <w:characterSpacingControl w:val="doNotCompress"/>
+  <w:compat>
+    <w:compatSetting w:name="compatibilityMode" w:uri="http://schemas.microsoft.com/office/word" w:val="15"/>
+    <w:compatSetting w:name="overrideTableStyleFontSizeAndJustification" w:uri="http://schemas.microsoft.com/office/word" w:val="1"/>
+    <w:compatSetting w:name="enableOpenTypeFeatures" w:uri="http://schemas.microsoft.com/office/word" w:val="1"/>
+    <w:compatSetting w:name="doNotFlipMirrorIndents" w:uri="http://schemas.microsoft.com/office/word" w:val="1"/>
+    <w:compatSetting w:name="differentiateMultirowTableHeaders" w:uri="http://schemas.microsoft.com/office/word" w:val="1"/>
+    <w:compatSetting w:name="useWord2013TrackBottomHyphenation" w:uri="http://schemas.microsoft.com/office/word" w:val="0"/>
+  </w:compat>
+  <w:rsids>
+    <w:rsidRoot w:val="00454CCC"/>
+    <w:rsid w:val="00001744"/>
+    <w:rsid w:val="00113F35"/>
+    <w:rsid w:val="00201A32"/>
+    <w:rsid w:val="00203177"/>
+    <w:rsid w:val="0027414F"/>
+    <w:rsid w:val="002B580A"/>
+    <w:rsid w:val="002D1E00"/>
+    <w:rsid w:val="002F712F"/>
+    <w:rsid w:val="003035EC"/>
+    <w:rsid w:val="00454CCC"/>
+    <w:rsid w:val="004A259C"/>
+    <w:rsid w:val="004C26FF"/>
+    <w:rsid w:val="00534B41"/>
+    <w:rsid w:val="0055656A"/>
+    <w:rsid w:val="00591B71"/>
+    <w:rsid w:val="005A18C6"/>
+    <w:rsid w:val="006623A7"/>
+    <w:rsid w:val="00680DCF"/>
+    <w:rsid w:val="0074774B"/>
+    <w:rsid w:val="007D39A6"/>
+    <w:rsid w:val="00832181"/>
+    <w:rsid w:val="008A17C0"/>
+    <w:rsid w:val="008D6902"/>
+    <w:rsid w:val="00936227"/>
+    <w:rsid w:val="0095601B"/>
+    <w:rsid w:val="00967048"/>
+    <w:rsid w:val="009B4FFA"/>
+    <w:rsid w:val="009B6789"/>
+    <w:rsid w:val="00A07913"/>
+    <w:rsid w:val="00A1411B"/>
+    <w:rsid w:val="00A2235A"/>
+    <w:rsid w:val="00A24625"/>
+    <w:rsid w:val="00A53C54"/>
+    <w:rsid w:val="00A76BD4"/>
+    <w:rsid w:val="00B2644C"/>
+    <w:rsid w:val="00B45027"/>
+    <w:rsid w:val="00BB7902"/>
+    <w:rsid w:val="00BD6206"/>
+    <w:rsid w:val="00BF3206"/>
+    <w:rsid w:val="00C06C35"/>
+    <w:rsid w:val="00C76C0F"/>
+    <w:rsid w:val="00CB5450"/>
+    <w:rsid w:val="00E3246F"/>
+    <w:rsid w:val="00E66103"/>
+  </w:rsids>
+  <m:mathPr>
+    <m:mathFont m:val="Cambria Math"/>
+    <m:brkBin m:val="before"/>
+    <m:brkBinSub m:val="--"/>
+    <m:smallFrac m:val="0"/>
+    <m:dispDef/>
+    <m:lMargin m:val="0"/>
+    <m:rMargin m:val="0"/>
+    <m:defJc m:val="centerGroup"/>
+    <m:wrapIndent m:val="1440"/>
+    <m:intLim m:val="subSup"/>
+    <m:naryLim m:val="undOvr"/>
+  </m:mathPr>
+  <w:themeFontLang w:val="en-US"/>
+  <w:clrSchemeMapping w:bg1="light1" w:t1="dark1" w:bg2="light2" w:t2="dark2" w:accent1="accent1" w:accent2="accent2" w:accent3="accent3" w:accent4="accent4" w:accent5="accent5" w:accent6="accent6" w:hyperlink="hyperlink" w:followedHyperlink="followedHyperlink"/>
+  <w:shapeDefaults>
+    <o:shapedefaults v:ext="edit" spidmax="1026"/>
+    <o:shapelayout v:ext="edit">
+      <o:idmap v:ext="edit" data="1"/>
+    </o:shapelayout>
+  </w:shapeDefaults>
+  <w:decimalSymbol w:val=","/>
+  <w:listSeparator w:val=","/>
+  <w14:docId w14:val="53D69FBE"/>
+  <w15:chartTrackingRefBased/>
+  <w15:docId w15:val="{EE55B02D-FB87-4EC2-A931-22D0426563BD}"/>
+</w:settings>
+</file>
+
+<file path=word\styles.xml><?xml version="1.0" encoding="utf-8"?>
 <w:styles xmlns:mc="http://schemas.openxmlformats.org/markup-compatibility/2006" xmlns:r="http://schemas.openxmlformats.org/officeDocument/2006/relationships" xmlns:w="http://schemas.openxmlformats.org/wordprocessingml/2006/main" xmlns:w14="http://schemas.microsoft.com/office/word/2010/wordml" xmlns:w15="http://schemas.microsoft.com/office/word/2012/wordml" xmlns:w16cid="http://schemas.microsoft.com/office/word/2016/wordml/cid" xmlns:w16se="http://schemas.microsoft.com/office/word/2015/wordml/symex" mc:Ignorable="w14 w15 w16se w16cid">
   <w:docDefaults>
     <w:rPrDefault>
@@ -7249,7 +7435,7 @@
 </w:styles>
 </file>
 
-<file path=word/theme/theme1.xml><?xml version="1.0" encoding="utf-8"?>
+<file path=word\theme\theme1.xml><?xml version="1.0" encoding="utf-8"?>
 <a:theme xmlns:a="http://schemas.openxmlformats.org/drawingml/2006/main" name="Office Theme">
   <a:themeElements>
     <a:clrScheme name="Office">
@@ -7542,4 +7728,92 @@
     </a:ext>
   </a:extLst>
 </a:theme>
+</file>
+
+<file path=word\webSettings.xml><?xml version="1.0" encoding="utf-8"?>
+<w:webSettings xmlns:mc="http://schemas.openxmlformats.org/markup-compatibility/2006" xmlns:r="http://schemas.openxmlformats.org/officeDocument/2006/relationships" xmlns:w="http://schemas.openxmlformats.org/wordprocessingml/2006/main" xmlns:w14="http://schemas.microsoft.com/office/word/2010/wordml" xmlns:w15="http://schemas.microsoft.com/office/word/2012/wordml" xmlns:w16cid="http://schemas.microsoft.com/office/word/2016/wordml/cid" xmlns:w16se="http://schemas.microsoft.com/office/word/2015/wordml/symex" mc:Ignorable="w14 w15 w16se w16cid">
+  <w:divs>
+    <w:div w:id="269552788">
+      <w:bodyDiv w:val="1"/>
+      <w:marLeft w:val="0"/>
+      <w:marRight w:val="0"/>
+      <w:marTop w:val="0"/>
+      <w:marBottom w:val="0"/>
+      <w:divBdr>
+        <w:top w:val="none" w:sz="0" w:space="0" w:color="auto"/>
+        <w:left w:val="none" w:sz="0" w:space="0" w:color="auto"/>
+        <w:bottom w:val="none" w:sz="0" w:space="0" w:color="auto"/>
+        <w:right w:val="none" w:sz="0" w:space="0" w:color="auto"/>
+      </w:divBdr>
+    </w:div>
+    <w:div w:id="507602964">
+      <w:bodyDiv w:val="1"/>
+      <w:marLeft w:val="0"/>
+      <w:marRight w:val="0"/>
+      <w:marTop w:val="0"/>
+      <w:marBottom w:val="0"/>
+      <w:divBdr>
+        <w:top w:val="none" w:sz="0" w:space="0" w:color="auto"/>
+        <w:left w:val="none" w:sz="0" w:space="0" w:color="auto"/>
+        <w:bottom w:val="none" w:sz="0" w:space="0" w:color="auto"/>
+        <w:right w:val="none" w:sz="0" w:space="0" w:color="auto"/>
+      </w:divBdr>
+    </w:div>
+    <w:div w:id="1281643755">
+      <w:bodyDiv w:val="1"/>
+      <w:marLeft w:val="0"/>
+      <w:marRight w:val="0"/>
+      <w:marTop w:val="0"/>
+      <w:marBottom w:val="0"/>
+      <w:divBdr>
+        <w:top w:val="none" w:sz="0" w:space="0" w:color="auto"/>
+        <w:left w:val="none" w:sz="0" w:space="0" w:color="auto"/>
+        <w:bottom w:val="none" w:sz="0" w:space="0" w:color="auto"/>
+        <w:right w:val="none" w:sz="0" w:space="0" w:color="auto"/>
+      </w:divBdr>
+    </w:div>
+    <w:div w:id="1303578669">
+      <w:bodyDiv w:val="1"/>
+      <w:marLeft w:val="0"/>
+      <w:marRight w:val="0"/>
+      <w:marTop w:val="0"/>
+      <w:marBottom w:val="0"/>
+      <w:divBdr>
+        <w:top w:val="none" w:sz="0" w:space="0" w:color="auto"/>
+        <w:left w:val="none" w:sz="0" w:space="0" w:color="auto"/>
+        <w:bottom w:val="none" w:sz="0" w:space="0" w:color="auto"/>
+        <w:right w:val="none" w:sz="0" w:space="0" w:color="auto"/>
+      </w:divBdr>
+    </w:div>
+    <w:div w:id="1325933993">
+      <w:bodyDiv w:val="1"/>
+      <w:marLeft w:val="0"/>
+      <w:marRight w:val="0"/>
+      <w:marTop w:val="0"/>
+      <w:marBottom w:val="0"/>
+      <w:divBdr>
+        <w:top w:val="none" w:sz="0" w:space="0" w:color="auto"/>
+        <w:left w:val="none" w:sz="0" w:space="0" w:color="auto"/>
+        <w:bottom w:val="none" w:sz="0" w:space="0" w:color="auto"/>
+        <w:right w:val="none" w:sz="0" w:space="0" w:color="auto"/>
+      </w:divBdr>
+    </w:div>
+    <w:div w:id="1434278950">
+      <w:bodyDiv w:val="1"/>
+      <w:marLeft w:val="0"/>
+      <w:marRight w:val="0"/>
+      <w:marTop w:val="0"/>
+      <w:marBottom w:val="0"/>
+      <w:divBdr>
+        <w:top w:val="none" w:sz="0" w:space="0" w:color="auto"/>
+        <w:left w:val="none" w:sz="0" w:space="0" w:color="auto"/>
+        <w:bottom w:val="none" w:sz="0" w:space="0" w:color="auto"/>
+        <w:right w:val="none" w:sz="0" w:space="0" w:color="auto"/>
+      </w:divBdr>
+    </w:div>
+  </w:divs>
+  <w:optimizeForBrowser/>
+  <w:relyOnVML/>
+  <w:allowPNG/>
+</w:webSettings>
 </file>
</xml_diff>